<commit_message>
excelParser.js now extracts CP/PC/CY flags from the row for each parameter and stores them in currentOp.parameterCriticalities[<paramKey>]. bmrGenerator.js checks parameterCriticalities when building the “Actual Data” lines and appends [WARNING: …] if present.
</commit_message>
<xml_diff>
--- a/TP.2 ATI_BMR.docx
+++ b/TP.2 ATI_BMR.docx
@@ -202,7 +202,7 @@
           </w:p>
           <w:p>
             <w:r>
-              <w:t xml:space="preserve">Actual Stirring, critical for the process!!!: __________ rpm;</w:t>
+              <w:t xml:space="preserve">Actual Stirring, critical for the process!!!: __________ rpm; [WARNING: PC]</w:t>
             </w:r>
           </w:p>
           <w:p>
@@ -285,7 +285,7 @@
           </w:p>
           <w:p>
             <w:r>
-              <w:t xml:space="preserve">Actual Stirring: __________ rpm;</w:t>
+              <w:t xml:space="preserve">Actual Stirring: __________ rpm; [WARNING: PC]</w:t>
             </w:r>
           </w:p>
           <w:p>

</xml_diff>

<commit_message>
ready before next update
</commit_message>
<xml_diff>
--- a/TP.2 ATI_BMR.docx
+++ b/TP.2 ATI_BMR.docx
@@ -60,32 +60,67 @@
           </w:p>
           <w:p>
             <w:r>
-              <w:t xml:space="preserve">  1. Remove the secondary package and carefully open the primary package.</w:t>
-            </w:r>
-          </w:p>
-          <w:p>
-            <w:r>
-              <w:t xml:space="preserve">  2. Weigh the required amount of IP.1 using balance 007-XX into a jug TP.2 ATI.</w:t>
-            </w:r>
-          </w:p>
-          <w:p>
-            <w:r>
-              <w:t xml:space="preserve">  3. Load IP.1 into the Reactor via handhole using plastic scoop.</w:t>
-            </w:r>
-          </w:p>
-          <w:p>
-            <w:r>
-              <w:t xml:space="preserve">  4. Set stirring rate in reactor 002-XX to 150-200rpm.</w:t>
-            </w:r>
-          </w:p>
-          <w:p>
-            <w:r>
-              <w:t xml:space="preserve">  </w:t>
-            </w:r>
-          </w:p>
-          <w:p>
-            <w:r>
-              <w:t xml:space="preserve">  Specified loading: ….. kg ( …. - … kg)</w:t>
+              <w:t xml:space="preserve">1. Remove the secondary package and carefully open the primary package.</w:t>
+            </w:r>
+          </w:p>
+          <w:p>
+            <w:r>
+              <w:t xml:space="preserve">2. Weigh the required amount of IP.1 using balance 007-XX into a jug TP.2 ATI.</w:t>
+            </w:r>
+          </w:p>
+          <w:p>
+            <w:r>
+              <w:t xml:space="preserve">3. Load IP.1 into the Reactor via handhole using a plastic scoop.</w:t>
+            </w:r>
+          </w:p>
+          <w:p>
+            <w:r>
+              <w:t xml:space="preserve">4. Set stirring rate in reactor 002-XX to .</w:t>
+            </w:r>
+          </w:p>
+          <w:p>
+            <w:r>
+              <w:t xml:space="preserve">5. Set inert gas flow rate to .</w:t>
+            </w:r>
+          </w:p>
+          <w:p>
+            <w:r>
+              <w:t xml:space="preserve">6. Adjust pH check to .</w:t>
+            </w:r>
+          </w:p>
+          <w:p>
+            <w:r>
+              <w:t xml:space="preserve">7. Set temperature to 15-25°C.</w:t>
+            </w:r>
+          </w:p>
+          <w:p>
+            <w:r>
+              <w:t xml:space="preserve">8. Record actual temperature: .</w:t>
+            </w:r>
+          </w:p>
+          <w:p>
+            <w:r>
+              <w:t xml:space="preserve">9. Note addition rate: in one portion.</w:t>
+            </w:r>
+          </w:p>
+          <w:p>
+            <w:r>
+              <w:t xml:space="preserve">10. Apply loading over time if needed: .</w:t>
+            </w:r>
+          </w:p>
+          <w:p>
+            <w:r>
+              <w:t xml:space="preserve">11. (Optional) Verify loaded material temperature: .</w:t>
+            </w:r>
+          </w:p>
+          <w:p>
+            <w:r>
+              <w:t xml:space="preserve"/>
+            </w:r>
+          </w:p>
+          <w:p>
+            <w:r>
+              <w:t xml:space="preserve">Specified loading: ….. kg (range: … - … kg)</w:t>
             </w:r>
           </w:p>
         </w:tc>
@@ -143,27 +178,62 @@
           </w:p>
           <w:p>
             <w:r>
-              <w:t xml:space="preserve">  1. Weigh the required amount of Acetone using balance 007-XX.</w:t>
-            </w:r>
-          </w:p>
-          <w:p>
-            <w:r>
-              <w:t xml:space="preserve">  2. Connect peristaltic pump 001-XX and hose TP.2 ATI. Set pump to [XX-XX]%.</w:t>
-            </w:r>
-          </w:p>
-          <w:p>
-            <w:r>
-              <w:t xml:space="preserve">  3. Using the peristaltic pump, load Acetone into the reactor via the loading port.</w:t>
-            </w:r>
-          </w:p>
-          <w:p>
-            <w:r>
-              <w:t xml:space="preserve">  </w:t>
-            </w:r>
-          </w:p>
-          <w:p>
-            <w:r>
-              <w:t xml:space="preserve">  Specified loading: ….. kg ( …. - … kg)</w:t>
+              <w:t xml:space="preserve">1. Weigh the required amount of Acetone using balance 007-XX.</w:t>
+            </w:r>
+          </w:p>
+          <w:p>
+            <w:r>
+              <w:t xml:space="preserve">2. Connect peristaltic pump 001-XX and hose TP.2 ATI; set pump to in one portion%.</w:t>
+            </w:r>
+          </w:p>
+          <w:p>
+            <w:r>
+              <w:t xml:space="preserve">3. Using the peristaltic pump, load Acetone via the loading port.</w:t>
+            </w:r>
+          </w:p>
+          <w:p>
+            <w:r>
+              <w:t xml:space="preserve">4. Set/keep stirring rate in reactor 002-XX to .</w:t>
+            </w:r>
+          </w:p>
+          <w:p>
+            <w:r>
+              <w:t xml:space="preserve">5. Set/keep inert gas flow rate to .</w:t>
+            </w:r>
+          </w:p>
+          <w:p>
+            <w:r>
+              <w:t xml:space="preserve">6. Adjust pH check to .</w:t>
+            </w:r>
+          </w:p>
+          <w:p>
+            <w:r>
+              <w:t xml:space="preserve">7. Set temperature to 15-25°C.</w:t>
+            </w:r>
+          </w:p>
+          <w:p>
+            <w:r>
+              <w:t xml:space="preserve">8. Record actual temperature: .</w:t>
+            </w:r>
+          </w:p>
+          <w:p>
+            <w:r>
+              <w:t xml:space="preserve">9. Apply loading over time if needed: .</w:t>
+            </w:r>
+          </w:p>
+          <w:p>
+            <w:r>
+              <w:t xml:space="preserve">10. (Optional) Verify loaded material temperature: .</w:t>
+            </w:r>
+          </w:p>
+          <w:p>
+            <w:r>
+              <w:t xml:space="preserve"/>
+            </w:r>
+          </w:p>
+          <w:p>
+            <w:r>
+              <w:t xml:space="preserve">Specified loading: ….. kg (range: … - … kg)</w:t>
             </w:r>
           </w:p>
         </w:tc>
@@ -202,7 +272,7 @@
           </w:p>
           <w:p>
             <w:r>
-              <w:t xml:space="preserve">Actual Stirring, critical for the process!!!: __________ rpm; [WARNING: PC]</w:t>
+              <w:t xml:space="preserve">Actual Stirring, critical for the process!!!: __________ rpm;</w:t>
             </w:r>
           </w:p>
           <w:p>
@@ -221,32 +291,67 @@
           </w:p>
           <w:p>
             <w:r>
-              <w:t xml:space="preserve">  1. Remove the secondary package and carefully open the primary package.</w:t>
-            </w:r>
-          </w:p>
-          <w:p>
-            <w:r>
-              <w:t xml:space="preserve">  2. Weigh the required amount of Potassium carbonate using balance 007-XX into a jug TP.2 ATI.</w:t>
-            </w:r>
-          </w:p>
-          <w:p>
-            <w:r>
-              <w:t xml:space="preserve">  3. Load Potassium carbonate into the Reactor via handhole using plastic scoop.</w:t>
-            </w:r>
-          </w:p>
-          <w:p>
-            <w:r>
-              <w:t xml:space="preserve">  4. Set stirring rate in reactor 002-XX to 200rpm.</w:t>
-            </w:r>
-          </w:p>
-          <w:p>
-            <w:r>
-              <w:t xml:space="preserve">  </w:t>
-            </w:r>
-          </w:p>
-          <w:p>
-            <w:r>
-              <w:t xml:space="preserve">  Specified loading: ….. kg ( …. - … kg)</w:t>
+              <w:t xml:space="preserve">1. Remove the secondary package and carefully open the primary package.</w:t>
+            </w:r>
+          </w:p>
+          <w:p>
+            <w:r>
+              <w:t xml:space="preserve">2. Weigh the required amount of Potassium carbonate using balance 007-XX into a jug TP.2 ATI.</w:t>
+            </w:r>
+          </w:p>
+          <w:p>
+            <w:r>
+              <w:t xml:space="preserve">3. Load Potassium carbonate into the Reactor via handhole using a plastic scoop.</w:t>
+            </w:r>
+          </w:p>
+          <w:p>
+            <w:r>
+              <w:t xml:space="preserve">4. Set stirring rate in reactor 002-XX to .</w:t>
+            </w:r>
+          </w:p>
+          <w:p>
+            <w:r>
+              <w:t xml:space="preserve">5. Set inert gas flow rate to .</w:t>
+            </w:r>
+          </w:p>
+          <w:p>
+            <w:r>
+              <w:t xml:space="preserve">6. Adjust pH check to .</w:t>
+            </w:r>
+          </w:p>
+          <w:p>
+            <w:r>
+              <w:t xml:space="preserve">7. Set temperature to 15-25°C.</w:t>
+            </w:r>
+          </w:p>
+          <w:p>
+            <w:r>
+              <w:t xml:space="preserve">8. Record actual temperature: .</w:t>
+            </w:r>
+          </w:p>
+          <w:p>
+            <w:r>
+              <w:t xml:space="preserve">9. Note addition rate: portionwise.</w:t>
+            </w:r>
+          </w:p>
+          <w:p>
+            <w:r>
+              <w:t xml:space="preserve">10. Apply loading over time if needed: .</w:t>
+            </w:r>
+          </w:p>
+          <w:p>
+            <w:r>
+              <w:t xml:space="preserve">11. (Optional) Verify loaded material temperature: .</w:t>
+            </w:r>
+          </w:p>
+          <w:p>
+            <w:r>
+              <w:t xml:space="preserve"/>
+            </w:r>
+          </w:p>
+          <w:p>
+            <w:r>
+              <w:t xml:space="preserve">Specified loading: ….. kg (range: … - … kg)</w:t>
             </w:r>
           </w:p>
         </w:tc>
@@ -285,7 +390,7 @@
           </w:p>
           <w:p>
             <w:r>
-              <w:t xml:space="preserve">Actual Stirring: __________ rpm; [WARNING: PC]</w:t>
+              <w:t xml:space="preserve">Actual Stirring: __________ rpm;</w:t>
             </w:r>
           </w:p>
           <w:p>
@@ -304,32 +409,32 @@
           </w:p>
           <w:p>
             <w:r>
-              <w:t xml:space="preserve">  1. Set temperature to 15-25°C with a target of 15-25°C.</w:t>
-            </w:r>
-          </w:p>
-          <w:p>
-            <w:r>
-              <w:t xml:space="preserve">  2. Monitor actual temperature: .</w:t>
-            </w:r>
-          </w:p>
-          <w:p>
-            <w:r>
-              <w:t xml:space="preserve">  3. Adjust stirring rate to .</w:t>
-            </w:r>
-          </w:p>
-          <w:p>
-            <w:r>
-              <w:t xml:space="preserve">  4. Hold for the duration: 30-60min.</w:t>
-            </w:r>
-          </w:p>
-          <w:p>
-            <w:r>
-              <w:t xml:space="preserve">  5. Set inert gas flow rate to .</w:t>
-            </w:r>
-          </w:p>
-          <w:p>
-            <w:r>
-              <w:t xml:space="preserve">  6. Optional: Keeping the reaction overnight - .</w:t>
+              <w:t xml:space="preserve">1. Set temperature to 15-25°C with target 15-25°C.</w:t>
+            </w:r>
+          </w:p>
+          <w:p>
+            <w:r>
+              <w:t xml:space="preserve">2. Monitor actual temperature: .</w:t>
+            </w:r>
+          </w:p>
+          <w:p>
+            <w:r>
+              <w:t xml:space="preserve">3. Adjust stirring rate to .</w:t>
+            </w:r>
+          </w:p>
+          <w:p>
+            <w:r>
+              <w:t xml:space="preserve">4. Hold for duration: 30-60min.</w:t>
+            </w:r>
+          </w:p>
+          <w:p>
+            <w:r>
+              <w:t xml:space="preserve">5. Set inert gas flow rate to .</w:t>
+            </w:r>
+          </w:p>
+          <w:p>
+            <w:r>
+              <w:t xml:space="preserve">6. Maintain break point at .</w:t>
             </w:r>
           </w:p>
         </w:tc>
@@ -387,32 +492,67 @@
           </w:p>
           <w:p>
             <w:r>
-              <w:t xml:space="preserve">  1. Remove the secondary package and carefully open the primary package.</w:t>
-            </w:r>
-          </w:p>
-          <w:p>
-            <w:r>
-              <w:t xml:space="preserve">  2. Weigh the required amount of Iodoethane using balance 007-XX into a jug TP.2 ATI.</w:t>
-            </w:r>
-          </w:p>
-          <w:p>
-            <w:r>
-              <w:t xml:space="preserve">  3. Pour Iodoethane into the Reactor via handhole using plastic funnel TP.2 ATI.</w:t>
-            </w:r>
-          </w:p>
-          <w:p>
-            <w:r>
-              <w:t xml:space="preserve">  4. Set/keep stirring rate in reactor 002-XX to 150-200rpm.</w:t>
-            </w:r>
-          </w:p>
-          <w:p>
-            <w:r>
-              <w:t xml:space="preserve">  </w:t>
-            </w:r>
-          </w:p>
-          <w:p>
-            <w:r>
-              <w:t xml:space="preserve">  Specified loading: ….. kg ( …. - … kg)</w:t>
+              <w:t xml:space="preserve">1. Remove the secondary package and carefully open the primary package.</w:t>
+            </w:r>
+          </w:p>
+          <w:p>
+            <w:r>
+              <w:t xml:space="preserve">2. Weigh the required amount of Iodoethane using balance 007-XX into a jug TP.2 ATI.</w:t>
+            </w:r>
+          </w:p>
+          <w:p>
+            <w:r>
+              <w:t xml:space="preserve">3. Pour Iodoethane into the Reactor via handhole using a plastic funnel TP.2 ATI.</w:t>
+            </w:r>
+          </w:p>
+          <w:p>
+            <w:r>
+              <w:t xml:space="preserve">4. Set/keep stirring rate in reactor 002-XX to .</w:t>
+            </w:r>
+          </w:p>
+          <w:p>
+            <w:r>
+              <w:t xml:space="preserve">5. Set/keep inert gas flow rate to .</w:t>
+            </w:r>
+          </w:p>
+          <w:p>
+            <w:r>
+              <w:t xml:space="preserve">6. Adjust pH check to .</w:t>
+            </w:r>
+          </w:p>
+          <w:p>
+            <w:r>
+              <w:t xml:space="preserve">7. Set temperature to 15-25°C.</w:t>
+            </w:r>
+          </w:p>
+          <w:p>
+            <w:r>
+              <w:t xml:space="preserve">8. Record actual temperature: .</w:t>
+            </w:r>
+          </w:p>
+          <w:p>
+            <w:r>
+              <w:t xml:space="preserve">9. Note addition rate: one portion.</w:t>
+            </w:r>
+          </w:p>
+          <w:p>
+            <w:r>
+              <w:t xml:space="preserve">10. Apply loading over time if needed: .</w:t>
+            </w:r>
+          </w:p>
+          <w:p>
+            <w:r>
+              <w:t xml:space="preserve">11. (Optional) Verify loaded material temperature: .</w:t>
+            </w:r>
+          </w:p>
+          <w:p>
+            <w:r>
+              <w:t xml:space="preserve"/>
+            </w:r>
+          </w:p>
+          <w:p>
+            <w:r>
+              <w:t xml:space="preserve">Specified loading: ….. kg (range: … - … kg)</w:t>
             </w:r>
           </w:p>
         </w:tc>
@@ -470,32 +610,32 @@
           </w:p>
           <w:p>
             <w:r>
-              <w:t xml:space="preserve">  1. Set temperature to 65°C.</w:t>
-            </w:r>
-          </w:p>
-          <w:p>
-            <w:r>
-              <w:t xml:space="preserve">  2. Target temperature: reflux (55°C)..</w:t>
-            </w:r>
-          </w:p>
-          <w:p>
-            <w:r>
-              <w:t xml:space="preserve">  3. Monitor actual temperature.</w:t>
-            </w:r>
-          </w:p>
-          <w:p>
-            <w:r>
-              <w:t xml:space="preserve">  4. Adjust temperature rate to .</w:t>
-            </w:r>
-          </w:p>
-          <w:p>
-            <w:r>
-              <w:t xml:space="preserve">  5. Set stirring rate to .</w:t>
-            </w:r>
-          </w:p>
-          <w:p>
-            <w:r>
-              <w:t xml:space="preserve">  6. Configure inert gas flow rate to .</w:t>
+              <w:t xml:space="preserve">1. Set temperature to 65°C.</w:t>
+            </w:r>
+          </w:p>
+          <w:p>
+            <w:r>
+              <w:t xml:space="preserve">2. Target temperature: reflux (55°C)..</w:t>
+            </w:r>
+          </w:p>
+          <w:p>
+            <w:r>
+              <w:t xml:space="preserve">3. Monitor actual temperature: .</w:t>
+            </w:r>
+          </w:p>
+          <w:p>
+            <w:r>
+              <w:t xml:space="preserve">4. Adjust temperature rate to .</w:t>
+            </w:r>
+          </w:p>
+          <w:p>
+            <w:r>
+              <w:t xml:space="preserve">5. Set stirring rate to .</w:t>
+            </w:r>
+          </w:p>
+          <w:p>
+            <w:r>
+              <w:t xml:space="preserve">6. Configure inert gas flow rate to .</w:t>
             </w:r>
           </w:p>
         </w:tc>
@@ -553,32 +693,32 @@
           </w:p>
           <w:p>
             <w:r>
-              <w:t xml:space="preserve">  1. Set temperature to 65°C with a target of reflux (55°C)..</w:t>
-            </w:r>
-          </w:p>
-          <w:p>
-            <w:r>
-              <w:t xml:space="preserve">  2. Monitor actual temperature: .</w:t>
-            </w:r>
-          </w:p>
-          <w:p>
-            <w:r>
-              <w:t xml:space="preserve">  3. Adjust stirring rate to .</w:t>
-            </w:r>
-          </w:p>
-          <w:p>
-            <w:r>
-              <w:t xml:space="preserve">  4. Hold for the duration: 48-72h.</w:t>
-            </w:r>
-          </w:p>
-          <w:p>
-            <w:r>
-              <w:t xml:space="preserve">  5. Set inert gas flow rate to .</w:t>
-            </w:r>
-          </w:p>
-          <w:p>
-            <w:r>
-              <w:t xml:space="preserve">  6. Optional: Keeping the reaction overnight - YES.</w:t>
+              <w:t xml:space="preserve">1. Set temperature to 65°C with target reflux (55°C)..</w:t>
+            </w:r>
+          </w:p>
+          <w:p>
+            <w:r>
+              <w:t xml:space="preserve">2. Monitor actual temperature: .</w:t>
+            </w:r>
+          </w:p>
+          <w:p>
+            <w:r>
+              <w:t xml:space="preserve">3. Adjust stirring rate to .</w:t>
+            </w:r>
+          </w:p>
+          <w:p>
+            <w:r>
+              <w:t xml:space="preserve">4. Hold for duration: 48-72h.</w:t>
+            </w:r>
+          </w:p>
+          <w:p>
+            <w:r>
+              <w:t xml:space="preserve">5. Set inert gas flow rate to .</w:t>
+            </w:r>
+          </w:p>
+          <w:p>
+            <w:r>
+              <w:t xml:space="preserve">6. Maintain break point at YES.</w:t>
             </w:r>
           </w:p>
         </w:tc>
@@ -641,32 +781,32 @@
           </w:p>
           <w:p>
             <w:r>
-              <w:t xml:space="preserve">  1. Use IPC Method: .</w:t>
-            </w:r>
-          </w:p>
-          <w:p>
-            <w:r>
-              <w:t xml:space="preserve">  2. Apply sample quenching: .</w:t>
-            </w:r>
-          </w:p>
-          <w:p>
-            <w:r>
-              <w:t xml:space="preserve">  3. Expected Result: .</w:t>
-            </w:r>
-          </w:p>
-          <w:p>
-            <w:r>
-              <w:t xml:space="preserve">  4. On IPC failure, execute: continue boiling, no need to add anything.</w:t>
-            </w:r>
-          </w:p>
-          <w:p>
-            <w:r>
-              <w:t xml:space="preserve">  5. On IPC pass, execute: .</w:t>
-            </w:r>
-          </w:p>
-          <w:p>
-            <w:r>
-              <w:t xml:space="preserve">  6. Estimated time for analysis: .</w:t>
+              <w:t xml:space="preserve">1. Use IPC Method: .</w:t>
+            </w:r>
+          </w:p>
+          <w:p>
+            <w:r>
+              <w:t xml:space="preserve">2. Apply sample quenching: .</w:t>
+            </w:r>
+          </w:p>
+          <w:p>
+            <w:r>
+              <w:t xml:space="preserve">3. Expected Result: .</w:t>
+            </w:r>
+          </w:p>
+          <w:p>
+            <w:r>
+              <w:t xml:space="preserve">4. On IPC failure, execute: continue boiling, no need to add anything.</w:t>
+            </w:r>
+          </w:p>
+          <w:p>
+            <w:r>
+              <w:t xml:space="preserve">5. On IPC pass, execute: .</w:t>
+            </w:r>
+          </w:p>
+          <w:p>
+            <w:r>
+              <w:t xml:space="preserve">6. Estimated time for analysis: .</w:t>
             </w:r>
           </w:p>
         </w:tc>
@@ -772,22 +912,22 @@
           </w:p>
           <w:p>
             <w:r>
-              <w:t xml:space="preserve">  1. Set stirring rate to .</w:t>
-            </w:r>
-          </w:p>
-          <w:p>
-            <w:r>
-              <w:t xml:space="preserve">  2. Target pressure: .</w:t>
-            </w:r>
-          </w:p>
-          <w:p>
-            <w:r>
-              <w:t xml:space="preserve">  3. Monitor actual pressure: .</w:t>
-            </w:r>
-          </w:p>
-          <w:p>
-            <w:r>
-              <w:t xml:space="preserve">  4. Continue until the end point is achieved: dry FK.</w:t>
+              <w:t xml:space="preserve">1. Set stirring rate to .</w:t>
+            </w:r>
+          </w:p>
+          <w:p>
+            <w:r>
+              <w:t xml:space="preserve">2. Target pressure: .</w:t>
+            </w:r>
+          </w:p>
+          <w:p>
+            <w:r>
+              <w:t xml:space="preserve">3. Monitor actual pressure: .</w:t>
+            </w:r>
+          </w:p>
+          <w:p>
+            <w:r>
+              <w:t xml:space="preserve">4. Continue until end point: dry FK.</w:t>
             </w:r>
           </w:p>
         </w:tc>
@@ -835,17 +975,17 @@
           </w:p>
           <w:p>
             <w:r>
-              <w:t xml:space="preserve">  1. Use an amount of: .</w:t>
-            </w:r>
-          </w:p>
-          <w:p>
-            <w:r>
-              <w:t xml:space="preserve">  2. Ensure loaded material temperature is: 15-25°C.</w:t>
-            </w:r>
-          </w:p>
-          <w:p>
-            <w:r>
-              <w:t xml:space="preserve">  3. Mix on filter as per instructions: .</w:t>
+              <w:t xml:space="preserve">1. Use amount: .</w:t>
+            </w:r>
+          </w:p>
+          <w:p>
+            <w:r>
+              <w:t xml:space="preserve">2. Ensure loaded material temperature is 15-25°C.</w:t>
+            </w:r>
+          </w:p>
+          <w:p>
+            <w:r>
+              <w:t xml:space="preserve">3. Mix on filter as per instructions: .</w:t>
             </w:r>
           </w:p>
         </w:tc>
@@ -893,32 +1033,67 @@
           </w:p>
           <w:p>
             <w:r>
-              <w:t xml:space="preserve">  1. Remove the secondary package and carefully open the primary package.</w:t>
-            </w:r>
-          </w:p>
-          <w:p>
-            <w:r>
-              <w:t xml:space="preserve">  2. Weigh the required amount of Water using balance 007-XX into a jug TP.2 ATI.</w:t>
-            </w:r>
-          </w:p>
-          <w:p>
-            <w:r>
-              <w:t xml:space="preserve">  3. Pour Water into the Reactor via handhole using plastic funnel TP.2 ATI.</w:t>
-            </w:r>
-          </w:p>
-          <w:p>
-            <w:r>
-              <w:t xml:space="preserve">  4. Set/keep stirring rate in reactor 002-XX to OFF in the beginning, once it is unblocked, start stirring.rpm.</w:t>
-            </w:r>
-          </w:p>
-          <w:p>
-            <w:r>
-              <w:t xml:space="preserve">  </w:t>
-            </w:r>
-          </w:p>
-          <w:p>
-            <w:r>
-              <w:t xml:space="preserve">  Specified loading: ….. kg ( …. - … kg)</w:t>
+              <w:t xml:space="preserve">1. Remove the secondary package and carefully open the primary package.</w:t>
+            </w:r>
+          </w:p>
+          <w:p>
+            <w:r>
+              <w:t xml:space="preserve">2. Weigh the required amount of Water using balance 007-XX into a jug TP.2 ATI.</w:t>
+            </w:r>
+          </w:p>
+          <w:p>
+            <w:r>
+              <w:t xml:space="preserve">3. Pour Water into the Reactor via handhole using a plastic funnel TP.2 ATI.</w:t>
+            </w:r>
+          </w:p>
+          <w:p>
+            <w:r>
+              <w:t xml:space="preserve">4. Set/keep stirring rate in reactor 002-XX to .</w:t>
+            </w:r>
+          </w:p>
+          <w:p>
+            <w:r>
+              <w:t xml:space="preserve">5. Set/keep inert gas flow rate to .</w:t>
+            </w:r>
+          </w:p>
+          <w:p>
+            <w:r>
+              <w:t xml:space="preserve">6. Adjust pH check to .</w:t>
+            </w:r>
+          </w:p>
+          <w:p>
+            <w:r>
+              <w:t xml:space="preserve">7. Set temperature to 15-25°C.</w:t>
+            </w:r>
+          </w:p>
+          <w:p>
+            <w:r>
+              <w:t xml:space="preserve">8. Record actual temperature: .</w:t>
+            </w:r>
+          </w:p>
+          <w:p>
+            <w:r>
+              <w:t xml:space="preserve">9. Note addition rate: in one portion.</w:t>
+            </w:r>
+          </w:p>
+          <w:p>
+            <w:r>
+              <w:t xml:space="preserve">10. Apply loading over time if needed: .</w:t>
+            </w:r>
+          </w:p>
+          <w:p>
+            <w:r>
+              <w:t xml:space="preserve">11. (Optional) Verify loaded material temperature: .</w:t>
+            </w:r>
+          </w:p>
+          <w:p>
+            <w:r>
+              <w:t xml:space="preserve"/>
+            </w:r>
+          </w:p>
+          <w:p>
+            <w:r>
+              <w:t xml:space="preserve">Specified loading: ….. kg (range: … - … kg)</w:t>
             </w:r>
           </w:p>
         </w:tc>
@@ -1014,32 +1189,32 @@
           </w:p>
           <w:p>
             <w:r>
-              <w:t xml:space="preserve">  1. Set temperature to 65°C with a target of 30-50°C.</w:t>
-            </w:r>
-          </w:p>
-          <w:p>
-            <w:r>
-              <w:t xml:space="preserve">  2. Adjust pressure within range: 300-&gt;120Torr.</w:t>
-            </w:r>
-          </w:p>
-          <w:p>
-            <w:r>
-              <w:t xml:space="preserve">  3. Maintain stirring: 150-200rpm.</w:t>
-            </w:r>
-          </w:p>
-          <w:p>
-            <w:r>
-              <w:t xml:space="preserve">  4. Continue until end point is reached: as much as we can, as reactor allows us.</w:t>
-            </w:r>
-          </w:p>
-          <w:p>
-            <w:r>
-              <w:t xml:space="preserve">  5. Set inert gas flow rate to .</w:t>
-            </w:r>
-          </w:p>
-          <w:p>
-            <w:r>
-              <w:t xml:space="preserve">  6. Monitor and break at: YES, stop heat. And stir.</w:t>
+              <w:t xml:space="preserve">1. Set temperature to 65°C with target 30-50°C.</w:t>
+            </w:r>
+          </w:p>
+          <w:p>
+            <w:r>
+              <w:t xml:space="preserve">2. Adjust pressure within range: 300-&gt;120Torr.</w:t>
+            </w:r>
+          </w:p>
+          <w:p>
+            <w:r>
+              <w:t xml:space="preserve">3. Maintain stirring at 150-200rpm.</w:t>
+            </w:r>
+          </w:p>
+          <w:p>
+            <w:r>
+              <w:t xml:space="preserve">4. Continue until end point: as much as we can, as reactor allows us.</w:t>
+            </w:r>
+          </w:p>
+          <w:p>
+            <w:r>
+              <w:t xml:space="preserve">5. Set inert gas flow rate to .</w:t>
+            </w:r>
+          </w:p>
+          <w:p>
+            <w:r>
+              <w:t xml:space="preserve">6. Monitor and break at YES, stop heat. And stir.</w:t>
             </w:r>
           </w:p>
         </w:tc>
@@ -1107,32 +1282,62 @@
           </w:p>
           <w:p>
             <w:r>
-              <w:t xml:space="preserve">  1. Weigh the required amount of Anhydrous EtOH using balance 007-XX.</w:t>
-            </w:r>
-          </w:p>
-          <w:p>
-            <w:r>
-              <w:t xml:space="preserve">  2. Connect peristaltic pump 001-XX and hose TP.2 ATI. Set pump to [XX-XX]%.</w:t>
-            </w:r>
-          </w:p>
-          <w:p>
-            <w:r>
-              <w:t xml:space="preserve">  3. Using the peristaltic pump, load Anhydrous EtOH into the reactor via the loading port.</w:t>
-            </w:r>
-          </w:p>
-          <w:p>
-            <w:r>
-              <w:t xml:space="preserve">  4. Set/keep stirring rate in reactor 002-XX to 150-200rpm.</w:t>
-            </w:r>
-          </w:p>
-          <w:p>
-            <w:r>
-              <w:t xml:space="preserve">  </w:t>
-            </w:r>
-          </w:p>
-          <w:p>
-            <w:r>
-              <w:t xml:space="preserve">  Specified loading: ….. kg ( …. - … kg)</w:t>
+              <w:t xml:space="preserve">1. Weigh the required amount of Anhydrous EtOH using balance 007-XX.</w:t>
+            </w:r>
+          </w:p>
+          <w:p>
+            <w:r>
+              <w:t xml:space="preserve">2. Connect peristaltic pump 001-XX and hose TP.2 ATI; set pump to one portion%.</w:t>
+            </w:r>
+          </w:p>
+          <w:p>
+            <w:r>
+              <w:t xml:space="preserve">3. Using the peristaltic pump, load Anhydrous EtOH via the loading port.</w:t>
+            </w:r>
+          </w:p>
+          <w:p>
+            <w:r>
+              <w:t xml:space="preserve">4. Set/keep stirring rate in reactor 002-XX to .</w:t>
+            </w:r>
+          </w:p>
+          <w:p>
+            <w:r>
+              <w:t xml:space="preserve">5. Set/keep inert gas flow rate to .</w:t>
+            </w:r>
+          </w:p>
+          <w:p>
+            <w:r>
+              <w:t xml:space="preserve">6. Adjust pH check to .</w:t>
+            </w:r>
+          </w:p>
+          <w:p>
+            <w:r>
+              <w:t xml:space="preserve">7. Set temperature to .</w:t>
+            </w:r>
+          </w:p>
+          <w:p>
+            <w:r>
+              <w:t xml:space="preserve">8. Record actual temperature: .</w:t>
+            </w:r>
+          </w:p>
+          <w:p>
+            <w:r>
+              <w:t xml:space="preserve">9. Apply loading over time if needed: .</w:t>
+            </w:r>
+          </w:p>
+          <w:p>
+            <w:r>
+              <w:t xml:space="preserve">10. (Optional) Verify loaded material temperature: .</w:t>
+            </w:r>
+          </w:p>
+          <w:p>
+            <w:r>
+              <w:t xml:space="preserve"/>
+            </w:r>
+          </w:p>
+          <w:p>
+            <w:r>
+              <w:t xml:space="preserve">Specified loading: ….. kg (range: … - … kg)</w:t>
             </w:r>
           </w:p>
         </w:tc>
@@ -1180,32 +1385,32 @@
           </w:p>
           <w:p>
             <w:r>
-              <w:t xml:space="preserve">  1. Set temperature to 65°C with a target of 30-40°C.</w:t>
-            </w:r>
-          </w:p>
-          <w:p>
-            <w:r>
-              <w:t xml:space="preserve">  2. Adjust pressure within range: NLT100Torr.</w:t>
-            </w:r>
-          </w:p>
-          <w:p>
-            <w:r>
-              <w:t xml:space="preserve">  3. Maintain stirring: 150-200rpm.</w:t>
-            </w:r>
-          </w:p>
-          <w:p>
-            <w:r>
-              <w:t xml:space="preserve">  4. Continue until end point is reached: as much as we can, as reactor allows us.</w:t>
-            </w:r>
-          </w:p>
-          <w:p>
-            <w:r>
-              <w:t xml:space="preserve">  5. Set inert gas flow rate to .</w:t>
-            </w:r>
-          </w:p>
-          <w:p>
-            <w:r>
-              <w:t xml:space="preserve">  6. Monitor and break at: .</w:t>
+              <w:t xml:space="preserve">1. Set temperature to 65°C with target 30-40°C.</w:t>
+            </w:r>
+          </w:p>
+          <w:p>
+            <w:r>
+              <w:t xml:space="preserve">2. Adjust pressure within range: NLT100Torr.</w:t>
+            </w:r>
+          </w:p>
+          <w:p>
+            <w:r>
+              <w:t xml:space="preserve">3. Maintain stirring at 150-200rpm.</w:t>
+            </w:r>
+          </w:p>
+          <w:p>
+            <w:r>
+              <w:t xml:space="preserve">4. Continue until end point: as much as we can, as reactor allows us.</w:t>
+            </w:r>
+          </w:p>
+          <w:p>
+            <w:r>
+              <w:t xml:space="preserve">5. Set inert gas flow rate to .</w:t>
+            </w:r>
+          </w:p>
+          <w:p>
+            <w:r>
+              <w:t xml:space="preserve">6. Monitor and break at .</w:t>
             </w:r>
           </w:p>
         </w:tc>
@@ -1268,32 +1473,62 @@
           </w:p>
           <w:p>
             <w:r>
-              <w:t xml:space="preserve">  1. Weigh the required amount of Anhydrous EtOH using balance 007-XX.</w:t>
-            </w:r>
-          </w:p>
-          <w:p>
-            <w:r>
-              <w:t xml:space="preserve">  2. Connect peristaltic pump 001-XX and hose TP.2 ATI. Set pump to [XX-XX]%.</w:t>
-            </w:r>
-          </w:p>
-          <w:p>
-            <w:r>
-              <w:t xml:space="preserve">  3. Using the peristaltic pump, load Anhydrous EtOH into the reactor via the loading port.</w:t>
-            </w:r>
-          </w:p>
-          <w:p>
-            <w:r>
-              <w:t xml:space="preserve">  4. Set/keep stirring rate in reactor 002-XX to 150-200rpm.</w:t>
-            </w:r>
-          </w:p>
-          <w:p>
-            <w:r>
-              <w:t xml:space="preserve">  </w:t>
-            </w:r>
-          </w:p>
-          <w:p>
-            <w:r>
-              <w:t xml:space="preserve">  Specified loading: ….. kg ( …. - … kg)</w:t>
+              <w:t xml:space="preserve">1. Weigh the required amount of Anhydrous EtOH using balance 007-XX.</w:t>
+            </w:r>
+          </w:p>
+          <w:p>
+            <w:r>
+              <w:t xml:space="preserve">2. Connect peristaltic pump 001-XX and hose TP.2 ATI; set pump to one portion%.</w:t>
+            </w:r>
+          </w:p>
+          <w:p>
+            <w:r>
+              <w:t xml:space="preserve">3. Using the peristaltic pump, load Anhydrous EtOH via the loading port.</w:t>
+            </w:r>
+          </w:p>
+          <w:p>
+            <w:r>
+              <w:t xml:space="preserve">4. Set/keep stirring rate in reactor 002-XX to .</w:t>
+            </w:r>
+          </w:p>
+          <w:p>
+            <w:r>
+              <w:t xml:space="preserve">5. Set/keep inert gas flow rate to .</w:t>
+            </w:r>
+          </w:p>
+          <w:p>
+            <w:r>
+              <w:t xml:space="preserve">6. Adjust pH check to .</w:t>
+            </w:r>
+          </w:p>
+          <w:p>
+            <w:r>
+              <w:t xml:space="preserve">7. Set temperature to -10…10°C.</w:t>
+            </w:r>
+          </w:p>
+          <w:p>
+            <w:r>
+              <w:t xml:space="preserve">8. Record actual temperature: .</w:t>
+            </w:r>
+          </w:p>
+          <w:p>
+            <w:r>
+              <w:t xml:space="preserve">9. Apply loading over time if needed: .</w:t>
+            </w:r>
+          </w:p>
+          <w:p>
+            <w:r>
+              <w:t xml:space="preserve">10. (Optional) Verify loaded material temperature: .</w:t>
+            </w:r>
+          </w:p>
+          <w:p>
+            <w:r>
+              <w:t xml:space="preserve"/>
+            </w:r>
+          </w:p>
+          <w:p>
+            <w:r>
+              <w:t xml:space="preserve">Specified loading: ….. kg (range: … - … kg)</w:t>
             </w:r>
           </w:p>
         </w:tc>
@@ -1351,32 +1586,32 @@
           </w:p>
           <w:p>
             <w:r>
-              <w:t xml:space="preserve">  1. Set temperature to 10°C with a target of 10-15°C.</w:t>
-            </w:r>
-          </w:p>
-          <w:p>
-            <w:r>
-              <w:t xml:space="preserve">  2. Monitor actual temperature: .</w:t>
-            </w:r>
-          </w:p>
-          <w:p>
-            <w:r>
-              <w:t xml:space="preserve">  3. Adjust stirring rate to .</w:t>
-            </w:r>
-          </w:p>
-          <w:p>
-            <w:r>
-              <w:t xml:space="preserve">  4. Hold for the duration: 30-40min.</w:t>
-            </w:r>
-          </w:p>
-          <w:p>
-            <w:r>
-              <w:t xml:space="preserve">  5. Set inert gas flow rate to .</w:t>
-            </w:r>
-          </w:p>
-          <w:p>
-            <w:r>
-              <w:t xml:space="preserve">  6. Optional: Keeping the reaction overnight - yes.</w:t>
+              <w:t xml:space="preserve">1. Set temperature to 10°C with target 10-15°C.</w:t>
+            </w:r>
+          </w:p>
+          <w:p>
+            <w:r>
+              <w:t xml:space="preserve">2. Monitor actual temperature: .</w:t>
+            </w:r>
+          </w:p>
+          <w:p>
+            <w:r>
+              <w:t xml:space="preserve">3. Adjust stirring rate to .</w:t>
+            </w:r>
+          </w:p>
+          <w:p>
+            <w:r>
+              <w:t xml:space="preserve">4. Hold for duration: 30-40min.</w:t>
+            </w:r>
+          </w:p>
+          <w:p>
+            <w:r>
+              <w:t xml:space="preserve">5. Set inert gas flow rate to .</w:t>
+            </w:r>
+          </w:p>
+          <w:p>
+            <w:r>
+              <w:t xml:space="preserve">6. Maintain break point at yes.</w:t>
             </w:r>
           </w:p>
         </w:tc>
@@ -1439,22 +1674,22 @@
           </w:p>
           <w:p>
             <w:r>
-              <w:t xml:space="preserve">  1. Set stirring rate to .</w:t>
-            </w:r>
-          </w:p>
-          <w:p>
-            <w:r>
-              <w:t xml:space="preserve">  2. Target pressure: .</w:t>
-            </w:r>
-          </w:p>
-          <w:p>
-            <w:r>
-              <w:t xml:space="preserve">  3. Monitor actual pressure: .</w:t>
-            </w:r>
-          </w:p>
-          <w:p>
-            <w:r>
-              <w:t xml:space="preserve">  4. Continue until the end point is achieved: dry FK.</w:t>
+              <w:t xml:space="preserve">1. Set stirring rate to .</w:t>
+            </w:r>
+          </w:p>
+          <w:p>
+            <w:r>
+              <w:t xml:space="preserve">2. Target pressure: .</w:t>
+            </w:r>
+          </w:p>
+          <w:p>
+            <w:r>
+              <w:t xml:space="preserve">3. Monitor actual pressure: .</w:t>
+            </w:r>
+          </w:p>
+          <w:p>
+            <w:r>
+              <w:t xml:space="preserve">4. Continue until end point: dry FK.</w:t>
             </w:r>
           </w:p>
         </w:tc>
@@ -1717,17 +1952,17 @@
           </w:p>
           <w:p>
             <w:r>
-              <w:t xml:space="preserve">  1. Dry for the duration: 20-30min.</w:t>
-            </w:r>
-          </w:p>
-          <w:p>
-            <w:r>
-              <w:t xml:space="preserve">  2. Set target pressure to: .</w:t>
-            </w:r>
-          </w:p>
-          <w:p>
-            <w:r>
-              <w:t xml:space="preserve">  3. Consider air, moisture, and light sensitivity of the material.</w:t>
+              <w:t xml:space="preserve">1. Dry for the duration: 20-30min.</w:t>
+            </w:r>
+          </w:p>
+          <w:p>
+            <w:r>
+              <w:t xml:space="preserve">2. Set target pressure to .</w:t>
+            </w:r>
+          </w:p>
+          <w:p>
+            <w:r>
+              <w:t xml:space="preserve">3. Consider air, moisture, and light sensitivity of the material.</w:t>
             </w:r>
           </w:p>
         </w:tc>
@@ -1843,22 +2078,22 @@
           </w:p>
           <w:p>
             <w:r>
-              <w:t xml:space="preserve">  1. Use analytical sample amount: .</w:t>
-            </w:r>
-          </w:p>
-          <w:p>
-            <w:r>
-              <w:t xml:space="preserve">  2. Retain sample amount: .</w:t>
-            </w:r>
-          </w:p>
-          <w:p>
-            <w:r>
-              <w:t xml:space="preserve">  3. Pack using: .</w:t>
-            </w:r>
-          </w:p>
-          <w:p>
-            <w:r>
-              <w:t xml:space="preserve">  4. Account for air, moisture, and light sensitivity of the material.</w:t>
+              <w:t xml:space="preserve">1. Use analytical sample amount: .</w:t>
+            </w:r>
+          </w:p>
+          <w:p>
+            <w:r>
+              <w:t xml:space="preserve">2. Retain sample amount: .</w:t>
+            </w:r>
+          </w:p>
+          <w:p>
+            <w:r>
+              <w:t xml:space="preserve">3. Pack using: .</w:t>
+            </w:r>
+          </w:p>
+          <w:p>
+            <w:r>
+              <w:t xml:space="preserve">4. Consider air, moisture, and light sensitivity of the material: .</w:t>
             </w:r>
           </w:p>
         </w:tc>
@@ -1954,12 +2189,12 @@
           </w:p>
           <w:p>
             <w:r>
-              <w:t xml:space="preserve">  1. Follow the solvent sequence: .</w:t>
-            </w:r>
-          </w:p>
-          <w:p>
-            <w:r>
-              <w:t xml:space="preserve">  2. Estimated time required: .</w:t>
+              <w:t xml:space="preserve">1. Follow the solvent sequence: .</w:t>
+            </w:r>
+          </w:p>
+          <w:p>
+            <w:r>
+              <w:t xml:space="preserve">2. Estimated time required: .</w:t>
             </w:r>
           </w:p>
         </w:tc>
@@ -2007,17 +2242,17 @@
           </w:p>
           <w:p>
             <w:r>
-              <w:t xml:space="preserve">  1. Process water waste: .</w:t>
-            </w:r>
-          </w:p>
-          <w:p>
-            <w:r>
-              <w:t xml:space="preserve">  2. Process organic waste: can contain ethyliodide. Toxic waste label..</w:t>
-            </w:r>
-          </w:p>
-          <w:p>
-            <w:r>
-              <w:t xml:space="preserve">  3. Process solid waste: .</w:t>
+              <w:t xml:space="preserve">1. Process water waste: .</w:t>
+            </w:r>
+          </w:p>
+          <w:p>
+            <w:r>
+              <w:t xml:space="preserve">2. Process organic waste: can contain ethyliodide. Toxic waste label..</w:t>
+            </w:r>
+          </w:p>
+          <w:p>
+            <w:r>
+              <w:t xml:space="preserve">3. Process solid waste: .</w:t>
             </w:r>
           </w:p>
         </w:tc>

</xml_diff>